<commit_message>
assignment 1 2 3
</commit_message>
<xml_diff>
--- a/CSP571/src/Assignment 1 - Q3 Histogram.docx
+++ b/CSP571/src/Assignment 1 - Q3 Histogram.docx
@@ -32,15 +32,7 @@
         <w:t xml:space="preserve"> </w:t>
       </w:r>
       <w:r>
-        <w:t xml:space="preserve">Use the Shimazaki H. and </w:t>
-      </w:r>
-      <w:proofErr w:type="spellStart"/>
-      <w:r>
-        <w:t>Shinomoto</w:t>
-      </w:r>
-      <w:proofErr w:type="spellEnd"/>
-      <w:r>
-        <w:t xml:space="preserve"> S. (2007) algorithm to help you choose the bin width that best represents the histogram for </w:t>
+        <w:t xml:space="preserve">Use the Shimazaki H. and Shinomoto S. (2007) algorithm to help you choose the bin width that best represents the histogram for </w:t>
       </w:r>
       <w:r>
         <w:rPr>
@@ -50,15 +42,7 @@
         <w:t>Annual Salary</w:t>
       </w:r>
       <w:r>
-        <w:t xml:space="preserve">. To facilitate interpretation, we will restrict the number of bins between 10 and </w:t>
-      </w:r>
-      <w:proofErr w:type="gramStart"/>
-      <w:r>
-        <w:t>50.Please</w:t>
-      </w:r>
-      <w:proofErr w:type="gramEnd"/>
-      <w:r>
-        <w:t xml:space="preserve"> show a table of possible choices of bin width, their number of bins, and the optimization criterion value. Please also generate the histogram using your choice</w:t>
+        <w:t>. To facilitate interpretation, we will restrict the number of bins between 10 and 50.Please show a table of possible choices of bin width, their number of bins, and the optimization criterion value. Please also generate the histogram using your choice</w:t>
       </w:r>
     </w:p>
     <w:p/>
@@ -93,17 +77,37 @@
     </w:p>
     <w:p>
       <w:r>
-        <w:t>P value 3, width $5000 and number of bins 27 has the lowest C value.</w:t>
+        <w:t xml:space="preserve">P value 3, width $5000 and number of bins </w:t>
+      </w:r>
+      <w:r>
+        <w:t>33</w:t>
+      </w:r>
+      <w:r>
+        <w:t xml:space="preserve"> has the lowest C value.</w:t>
+      </w:r>
+    </w:p>
+    <w:p>
+      <w:r>
+        <w:t>Please note we see a lot of values in the right hand side tail, despite winsorizing the data we still have outlier salaries. The</w:t>
+      </w:r>
+      <w:r>
+        <w:t xml:space="preserve"> </w:t>
+      </w:r>
+      <w:r>
+        <w:t xml:space="preserve">data is right skewed and outlier salaries will impact the mean of the data. </w:t>
       </w:r>
     </w:p>
     <w:p/>
     <w:p>
       <w:r>
+        <w:rPr>
+          <w:noProof/>
+        </w:rPr>
         <w:drawing>
-          <wp:inline distT="0" distB="0" distL="0" distR="0" wp14:anchorId="1A13175F" wp14:editId="633DC0EA">
-            <wp:extent cx="5731510" cy="4282440"/>
-            <wp:effectExtent l="0" t="0" r="2540" b="3810"/>
-            <wp:docPr id="1581856258" name="Picture 1"/>
+          <wp:inline distT="0" distB="0" distL="0" distR="0" wp14:anchorId="2C263978" wp14:editId="205100D5">
+            <wp:extent cx="5731510" cy="4279900"/>
+            <wp:effectExtent l="0" t="0" r="2540" b="6350"/>
+            <wp:docPr id="121997003" name="Picture 1"/>
             <wp:cNvGraphicFramePr>
               <a:graphicFrameLocks xmlns:a="http://schemas.openxmlformats.org/drawingml/2006/main" noChangeAspect="1"/>
             </wp:cNvGraphicFramePr>
@@ -111,7 +115,7 @@
               <a:graphicData uri="http://schemas.openxmlformats.org/drawingml/2006/picture">
                 <pic:pic xmlns:pic="http://schemas.openxmlformats.org/drawingml/2006/picture">
                   <pic:nvPicPr>
-                    <pic:cNvPr id="1581856258" name=""/>
+                    <pic:cNvPr id="121997003" name=""/>
                     <pic:cNvPicPr/>
                   </pic:nvPicPr>
                   <pic:blipFill>
@@ -123,7 +127,68 @@
                   <pic:spPr>
                     <a:xfrm>
                       <a:off x="0" y="0"/>
-                      <a:ext cx="5731510" cy="4282440"/>
+                      <a:ext cx="5731510" cy="4279900"/>
+                    </a:xfrm>
+                    <a:prstGeom prst="rect">
+                      <a:avLst/>
+                    </a:prstGeom>
+                  </pic:spPr>
+                </pic:pic>
+              </a:graphicData>
+            </a:graphic>
+          </wp:inline>
+        </w:drawing>
+      </w:r>
+    </w:p>
+    <w:p/>
+    <w:p>
+      <w:pPr>
+        <w:rPr>
+          <w:b/>
+          <w:bCs/>
+        </w:rPr>
+      </w:pPr>
+      <w:r>
+        <w:rPr>
+          <w:b/>
+          <w:bCs/>
+        </w:rPr>
+        <w:t xml:space="preserve">Without winsorizing the data we get the following result </w:t>
+      </w:r>
+    </w:p>
+    <w:p>
+      <w:r>
+        <w:t>Salary range is now from 13K to 350K</w:t>
+      </w:r>
+    </w:p>
+    <w:p>
+      <w:r>
+        <w:lastRenderedPageBreak/>
+        <w:drawing>
+          <wp:inline distT="0" distB="0" distL="0" distR="0" wp14:anchorId="40DACBBF" wp14:editId="24B02A57">
+            <wp:extent cx="5731510" cy="4307205"/>
+            <wp:effectExtent l="0" t="0" r="2540" b="0"/>
+            <wp:docPr id="490446726" name="Picture 1"/>
+            <wp:cNvGraphicFramePr>
+              <a:graphicFrameLocks xmlns:a="http://schemas.openxmlformats.org/drawingml/2006/main" noChangeAspect="1"/>
+            </wp:cNvGraphicFramePr>
+            <a:graphic xmlns:a="http://schemas.openxmlformats.org/drawingml/2006/main">
+              <a:graphicData uri="http://schemas.openxmlformats.org/drawingml/2006/picture">
+                <pic:pic xmlns:pic="http://schemas.openxmlformats.org/drawingml/2006/picture">
+                  <pic:nvPicPr>
+                    <pic:cNvPr id="490446726" name=""/>
+                    <pic:cNvPicPr/>
+                  </pic:nvPicPr>
+                  <pic:blipFill>
+                    <a:blip r:embed="rId5"/>
+                    <a:stretch>
+                      <a:fillRect/>
+                    </a:stretch>
+                  </pic:blipFill>
+                  <pic:spPr>
+                    <a:xfrm>
+                      <a:off x="0" y="0"/>
+                      <a:ext cx="5731510" cy="4307205"/>
                     </a:xfrm>
                     <a:prstGeom prst="rect">
                       <a:avLst/>
@@ -749,6 +814,7 @@
   <w:style w:type="character" w:default="1" w:styleId="DefaultParagraphFont">
     <w:name w:val="Default Paragraph Font"/>
     <w:uiPriority w:val="1"/>
+    <w:semiHidden/>
     <w:unhideWhenUsed/>
   </w:style>
   <w:style w:type="table" w:default="1" w:styleId="TableNormal">

</xml_diff>